<commit_message>
Update UKG interview process document
Refreshes the UKG interview process DOCX with updated content.
</commit_message>
<xml_diff>
--- a/company-wise-interview-docs/UKG-interviews-process.docx
+++ b/company-wise-interview-docs/UKG-interviews-process.docx
@@ -15,23 +15,7 @@
     </w:p>
     <w:p>
       <w:r>
-        <w:t xml:space="preserve">2. Implement comparison for version strings like "1.2.10" vs "1.3". // -1 Return -1, 0, or 1. // </w:t>
-      </w:r>
-      <w:proofErr w:type="gramStart"/>
-      <w:r>
-        <w:t>1.2.10 ,</w:t>
-      </w:r>
-      <w:proofErr w:type="gramEnd"/>
-      <w:r>
-        <w:t xml:space="preserve"> 1.2.8 ==&gt; 0 // </w:t>
-      </w:r>
-      <w:proofErr w:type="gramStart"/>
-      <w:r>
-        <w:t>1.2. ,</w:t>
-      </w:r>
-      <w:proofErr w:type="gramEnd"/>
-      <w:r>
-        <w:t xml:space="preserve"> 1.2 ===&gt; 1</w:t>
+        <w:t>2. Implement comparison for version strings like "1.2.10" vs "1.3". // -1 Return -1, 0, or 1. // 1.2.10 , 1.2.8 ==&gt; 0 // 1.2. , 1.2 ===&gt; 1</w:t>
       </w:r>
     </w:p>
     <w:p>
@@ -58,6 +42,1122 @@
     <w:p>
       <w:r>
         <w:t>4. Difference between TPL and async, await.</w:t>
+      </w:r>
+    </w:p>
+    <w:p>
+      <w:r>
+        <w:t xml:space="preserve"> Second round :</w:t>
+      </w:r>
+    </w:p>
+    <w:p>
+      <w:r>
+        <w:t>Notification system design round-</w:t>
+      </w:r>
+    </w:p>
+    <w:p>
+      <w:r>
+        <w:t>Other topics:</w:t>
+      </w:r>
+    </w:p>
+    <w:p>
+      <w:pPr>
+        <w:rPr>
+          <w:b/>
+          <w:bCs/>
+        </w:rPr>
+      </w:pPr>
+      <w:r>
+        <w:rPr>
+          <w:b/>
+          <w:bCs/>
+        </w:rPr>
+        <w:t>Top HLD System Design Scenarios for UKG Context:</w:t>
+      </w:r>
+    </w:p>
+    <w:p>
+      <w:pPr>
+        <w:numPr>
+          <w:ilvl w:val="0"/>
+          <w:numId w:val="1"/>
+        </w:numPr>
+      </w:pPr>
+      <w:r>
+        <w:rPr>
+          <w:b/>
+          <w:bCs/>
+        </w:rPr>
+        <w:t>Multi-Tenant SaaS Architecture &amp; Data Isolation</w:t>
+      </w:r>
+    </w:p>
+    <w:p>
+      <w:pPr>
+        <w:numPr>
+          <w:ilvl w:val="1"/>
+          <w:numId w:val="1"/>
+        </w:numPr>
+      </w:pPr>
+      <w:r>
+        <w:rPr>
+          <w:b/>
+          <w:bCs/>
+        </w:rPr>
+        <w:t>Core Problem:</w:t>
+      </w:r>
+      <w:r>
+        <w:t xml:space="preserve"> Designing a platform serving thousands of corporate tenants with strict security isolation, customizable tenant policies, and fair resource allocation. </w:t>
+      </w:r>
+    </w:p>
+    <w:p>
+      <w:pPr>
+        <w:numPr>
+          <w:ilvl w:val="1"/>
+          <w:numId w:val="1"/>
+        </w:numPr>
+      </w:pPr>
+      <w:r>
+        <w:rPr>
+          <w:b/>
+          <w:bCs/>
+        </w:rPr>
+        <w:t>Key Concepts to Cover:</w:t>
+      </w:r>
+      <w:r>
+        <w:t xml:space="preserve"> Tenant-per-database vs. shared database with tenant-id column/row-level security, dynamic routing, tenant rate limiting, noisy </w:t>
+      </w:r>
+      <w:proofErr w:type="spellStart"/>
+      <w:r>
+        <w:t>neighbor</w:t>
+      </w:r>
+      <w:proofErr w:type="spellEnd"/>
+      <w:r>
+        <w:t xml:space="preserve"> mitigation.</w:t>
+      </w:r>
+    </w:p>
+    <w:p>
+      <w:pPr>
+        <w:numPr>
+          <w:ilvl w:val="1"/>
+          <w:numId w:val="1"/>
+        </w:numPr>
+      </w:pPr>
+      <w:r>
+        <w:rPr>
+          <w:b/>
+          <w:bCs/>
+        </w:rPr>
+        <w:t>Your Real Example:</w:t>
+      </w:r>
+      <w:r>
+        <w:t xml:space="preserve"> Draw on the </w:t>
+      </w:r>
+      <w:r>
+        <w:rPr>
+          <w:b/>
+          <w:bCs/>
+        </w:rPr>
+        <w:t>NHS Open Predictor</w:t>
+      </w:r>
+      <w:r>
+        <w:t xml:space="preserve"> multi-tenant deployment strategy. </w:t>
+      </w:r>
+    </w:p>
+    <w:p>
+      <w:pPr>
+        <w:numPr>
+          <w:ilvl w:val="0"/>
+          <w:numId w:val="1"/>
+        </w:numPr>
+      </w:pPr>
+      <w:r>
+        <w:rPr>
+          <w:b/>
+          <w:bCs/>
+        </w:rPr>
+        <w:t>High-Throughput Time &amp; Attendance / Clock-In Ingestion System</w:t>
+      </w:r>
+    </w:p>
+    <w:p>
+      <w:pPr>
+        <w:numPr>
+          <w:ilvl w:val="1"/>
+          <w:numId w:val="1"/>
+        </w:numPr>
+      </w:pPr>
+      <w:r>
+        <w:rPr>
+          <w:b/>
+          <w:bCs/>
+        </w:rPr>
+        <w:t>Core Problem:</w:t>
+      </w:r>
+      <w:r>
+        <w:t xml:space="preserve"> Hundreds of thousands of employees clocking in/out within a 5-minute window at shift changes (extreme traffic spikes).</w:t>
+      </w:r>
+    </w:p>
+    <w:p>
+      <w:pPr>
+        <w:numPr>
+          <w:ilvl w:val="1"/>
+          <w:numId w:val="1"/>
+        </w:numPr>
+      </w:pPr>
+      <w:r>
+        <w:rPr>
+          <w:b/>
+          <w:bCs/>
+        </w:rPr>
+        <w:t>Key Concepts to Cover:</w:t>
+      </w:r>
+      <w:r>
+        <w:t xml:space="preserve"> Asynchronous ingestion pipelines, message queues (Kafka/RabbitMQ/Event Hubs), idempotency keys to avoid double clock-ins, batch DB updates, out-of-order event handling. </w:t>
+      </w:r>
+    </w:p>
+    <w:p>
+      <w:pPr>
+        <w:numPr>
+          <w:ilvl w:val="1"/>
+          <w:numId w:val="1"/>
+        </w:numPr>
+      </w:pPr>
+      <w:r>
+        <w:rPr>
+          <w:b/>
+          <w:bCs/>
+        </w:rPr>
+        <w:t>Your Real Example:</w:t>
+      </w:r>
+      <w:r>
+        <w:t xml:space="preserve"> Leverage your </w:t>
+      </w:r>
+      <w:r>
+        <w:rPr>
+          <w:b/>
+          <w:bCs/>
+        </w:rPr>
+        <w:t>MTN Data Masking</w:t>
+      </w:r>
+      <w:r>
+        <w:t xml:space="preserve"> event-triggered execution (converting polling to event triggers) and </w:t>
+      </w:r>
+      <w:r>
+        <w:rPr>
+          <w:b/>
+          <w:bCs/>
+        </w:rPr>
+        <w:t>NBA real-time streaming telemetry</w:t>
+      </w:r>
+      <w:r>
+        <w:t xml:space="preserve"> experience. </w:t>
+      </w:r>
+    </w:p>
+    <w:p>
+      <w:pPr>
+        <w:numPr>
+          <w:ilvl w:val="0"/>
+          <w:numId w:val="1"/>
+        </w:numPr>
+      </w:pPr>
+      <w:r>
+        <w:rPr>
+          <w:b/>
+          <w:bCs/>
+        </w:rPr>
+        <w:t>Distributed Job Scheduler &amp; Payroll Processing Engine</w:t>
+      </w:r>
+    </w:p>
+    <w:p>
+      <w:pPr>
+        <w:numPr>
+          <w:ilvl w:val="1"/>
+          <w:numId w:val="1"/>
+        </w:numPr>
+      </w:pPr>
+      <w:r>
+        <w:rPr>
+          <w:b/>
+          <w:bCs/>
+        </w:rPr>
+        <w:lastRenderedPageBreak/>
+        <w:t>Core Problem:</w:t>
+      </w:r>
+      <w:r>
+        <w:t xml:space="preserve"> Running heavy nightly/monthly payroll runs or shift notifications without blocking OLTP operations.</w:t>
+      </w:r>
+    </w:p>
+    <w:p>
+      <w:pPr>
+        <w:numPr>
+          <w:ilvl w:val="1"/>
+          <w:numId w:val="1"/>
+        </w:numPr>
+      </w:pPr>
+      <w:r>
+        <w:rPr>
+          <w:b/>
+          <w:bCs/>
+        </w:rPr>
+        <w:t>Key Concepts to Cover:</w:t>
+      </w:r>
+      <w:r>
+        <w:t xml:space="preserve"> Distributed locking (Redis/</w:t>
+      </w:r>
+      <w:proofErr w:type="spellStart"/>
+      <w:r>
+        <w:t>Redlock</w:t>
+      </w:r>
+      <w:proofErr w:type="spellEnd"/>
+      <w:r>
+        <w:t xml:space="preserve">), stateful vs. stateless workers, saga pattern for multi-step financial transactions, retry queues, dead-letter queues (DLQ), and exactly-once processing guarantees. </w:t>
+      </w:r>
+    </w:p>
+    <w:p>
+      <w:pPr>
+        <w:numPr>
+          <w:ilvl w:val="0"/>
+          <w:numId w:val="1"/>
+        </w:numPr>
+      </w:pPr>
+      <w:r>
+        <w:rPr>
+          <w:b/>
+          <w:bCs/>
+        </w:rPr>
+        <w:t>Distributed Rate Limiter &amp; API Gateway</w:t>
+      </w:r>
+    </w:p>
+    <w:p>
+      <w:pPr>
+        <w:numPr>
+          <w:ilvl w:val="1"/>
+          <w:numId w:val="1"/>
+        </w:numPr>
+      </w:pPr>
+      <w:r>
+        <w:rPr>
+          <w:b/>
+          <w:bCs/>
+        </w:rPr>
+        <w:t>Core Problem:</w:t>
+      </w:r>
+      <w:r>
+        <w:t xml:space="preserve"> Preventing abuse and enforcing API tiers across corporate tenants. </w:t>
+      </w:r>
+    </w:p>
+    <w:p>
+      <w:pPr>
+        <w:numPr>
+          <w:ilvl w:val="1"/>
+          <w:numId w:val="1"/>
+        </w:numPr>
+      </w:pPr>
+      <w:r>
+        <w:rPr>
+          <w:b/>
+          <w:bCs/>
+        </w:rPr>
+        <w:t>Key Concepts to Cover:</w:t>
+      </w:r>
+      <w:r>
+        <w:t xml:space="preserve"> Token Bucket vs. Sliding Window Log algorithms, centralized Redis counters vs. local cache synchronization trade-offs, fallback </w:t>
+      </w:r>
+      <w:proofErr w:type="spellStart"/>
+      <w:r>
+        <w:t>behavior</w:t>
+      </w:r>
+      <w:proofErr w:type="spellEnd"/>
+      <w:r>
+        <w:t xml:space="preserve"> when the caching layer fails. </w:t>
+      </w:r>
+    </w:p>
+    <w:p>
+      <w:pPr>
+        <w:numPr>
+          <w:ilvl w:val="0"/>
+          <w:numId w:val="1"/>
+        </w:numPr>
+      </w:pPr>
+      <w:r>
+        <w:rPr>
+          <w:b/>
+          <w:bCs/>
+        </w:rPr>
+        <w:t>Distributed Caching &amp; Read-Heavy Portals (CQRS)</w:t>
+      </w:r>
+    </w:p>
+    <w:p>
+      <w:pPr>
+        <w:numPr>
+          <w:ilvl w:val="1"/>
+          <w:numId w:val="1"/>
+        </w:numPr>
+      </w:pPr>
+      <w:r>
+        <w:rPr>
+          <w:b/>
+          <w:bCs/>
+        </w:rPr>
+        <w:t>Core Problem:</w:t>
+      </w:r>
+      <w:r>
+        <w:t xml:space="preserve"> Serving high-concurrency dashboards (e.g., employee self-service schedules/timesheets) with sub-second latency.</w:t>
+      </w:r>
+    </w:p>
+    <w:p>
+      <w:pPr>
+        <w:numPr>
+          <w:ilvl w:val="1"/>
+          <w:numId w:val="1"/>
+        </w:numPr>
+      </w:pPr>
+      <w:r>
+        <w:rPr>
+          <w:b/>
+          <w:bCs/>
+        </w:rPr>
+        <w:t>Key Concepts to Cover:</w:t>
+      </w:r>
+      <w:r>
+        <w:t xml:space="preserve"> CQRS pattern, read-replicas, cache invalidation strategies (Write-through, Cache-aside), APIM-level caching. </w:t>
+      </w:r>
+    </w:p>
+    <w:p>
+      <w:pPr>
+        <w:numPr>
+          <w:ilvl w:val="1"/>
+          <w:numId w:val="1"/>
+        </w:numPr>
+      </w:pPr>
+      <w:r>
+        <w:rPr>
+          <w:b/>
+          <w:bCs/>
+        </w:rPr>
+        <w:t>Your Real Example:</w:t>
+      </w:r>
+      <w:r>
+        <w:t xml:space="preserve"> Reference your </w:t>
+      </w:r>
+      <w:r>
+        <w:rPr>
+          <w:b/>
+          <w:bCs/>
+        </w:rPr>
+        <w:t>Constellation Energy Portal</w:t>
+      </w:r>
+      <w:r>
+        <w:t xml:space="preserve"> CQRS refactoring and read-replica architecture. </w:t>
+      </w:r>
+    </w:p>
+    <w:p>
+      <w:pPr>
+        <w:rPr>
+          <w:b/>
+          <w:bCs/>
+        </w:rPr>
+      </w:pPr>
+      <w:r>
+        <w:rPr>
+          <w:b/>
+          <w:bCs/>
+        </w:rPr>
+        <w:t>2. Low-Level Design (LLD) &amp; Object-Oriented Design Topics</w:t>
+      </w:r>
+    </w:p>
+    <w:p>
+      <w:r>
+        <w:t xml:space="preserve">In LLD, the Director checks if your architectural abstractions translate into clean, maintainable, and extensible code patterns. </w:t>
+      </w:r>
+    </w:p>
+    <w:p>
+      <w:pPr>
+        <w:rPr>
+          <w:b/>
+          <w:bCs/>
+        </w:rPr>
+      </w:pPr>
+      <w:r>
+        <w:rPr>
+          <w:b/>
+          <w:bCs/>
+        </w:rPr>
+        <w:t>Top LLD Scenarios to Master:</w:t>
+      </w:r>
+    </w:p>
+    <w:p>
+      <w:pPr>
+        <w:numPr>
+          <w:ilvl w:val="0"/>
+          <w:numId w:val="2"/>
+        </w:numPr>
+      </w:pPr>
+      <w:r>
+        <w:rPr>
+          <w:b/>
+          <w:bCs/>
+        </w:rPr>
+        <w:t>Design a Shift &amp; Employee Scheduler Engine</w:t>
+      </w:r>
+    </w:p>
+    <w:p>
+      <w:pPr>
+        <w:numPr>
+          <w:ilvl w:val="1"/>
+          <w:numId w:val="2"/>
+        </w:numPr>
+      </w:pPr>
+      <w:r>
+        <w:rPr>
+          <w:b/>
+          <w:bCs/>
+        </w:rPr>
+        <w:t>Class Diagram / Abstraction:</w:t>
+      </w:r>
+      <w:r>
+        <w:t xml:space="preserve"> Employee, Shift, Schedule, </w:t>
+      </w:r>
+      <w:proofErr w:type="spellStart"/>
+      <w:r>
+        <w:t>RuleEngine</w:t>
+      </w:r>
+      <w:proofErr w:type="spellEnd"/>
+      <w:r>
+        <w:t xml:space="preserve">, </w:t>
+      </w:r>
+      <w:proofErr w:type="spellStart"/>
+      <w:r>
+        <w:t>ConflictValidator</w:t>
+      </w:r>
+      <w:proofErr w:type="spellEnd"/>
+      <w:r>
+        <w:t>.</w:t>
+      </w:r>
+    </w:p>
+    <w:p>
+      <w:pPr>
+        <w:numPr>
+          <w:ilvl w:val="1"/>
+          <w:numId w:val="2"/>
+        </w:numPr>
+      </w:pPr>
+      <w:r>
+        <w:rPr>
+          <w:b/>
+          <w:bCs/>
+        </w:rPr>
+        <w:t>Design Patterns:</w:t>
+      </w:r>
+      <w:r>
+        <w:t xml:space="preserve"> </w:t>
+      </w:r>
+      <w:r>
+        <w:rPr>
+          <w:b/>
+          <w:bCs/>
+        </w:rPr>
+        <w:t>Strategy Pattern</w:t>
+      </w:r>
+      <w:r>
+        <w:t xml:space="preserve"> (for custom overtime/compliance laws per region/tenant), </w:t>
+      </w:r>
+      <w:r>
+        <w:rPr>
+          <w:b/>
+          <w:bCs/>
+        </w:rPr>
+        <w:t>Observer Pattern</w:t>
+      </w:r>
+      <w:r>
+        <w:t xml:space="preserve"> (for shift drop/trade notifications), </w:t>
+      </w:r>
+      <w:r>
+        <w:rPr>
+          <w:b/>
+          <w:bCs/>
+        </w:rPr>
+        <w:t>Factory Pattern</w:t>
+      </w:r>
+      <w:r>
+        <w:t xml:space="preserve"> (for creating different shift types).</w:t>
+      </w:r>
+    </w:p>
+    <w:p>
+      <w:pPr>
+        <w:numPr>
+          <w:ilvl w:val="1"/>
+          <w:numId w:val="2"/>
+        </w:numPr>
+      </w:pPr>
+      <w:r>
+        <w:rPr>
+          <w:b/>
+          <w:bCs/>
+        </w:rPr>
+        <w:t>Edge Cases:</w:t>
+      </w:r>
+      <w:r>
+        <w:t xml:space="preserve"> Overlapping shifts, union rules, max hours per week validations.</w:t>
+      </w:r>
+    </w:p>
+    <w:p>
+      <w:pPr>
+        <w:numPr>
+          <w:ilvl w:val="0"/>
+          <w:numId w:val="2"/>
+        </w:numPr>
+      </w:pPr>
+      <w:r>
+        <w:rPr>
+          <w:b/>
+          <w:bCs/>
+        </w:rPr>
+        <w:t>Design an Access Control &amp; Role-Based Permissions System (RBAC/ABAC)</w:t>
+      </w:r>
+    </w:p>
+    <w:p>
+      <w:pPr>
+        <w:numPr>
+          <w:ilvl w:val="1"/>
+          <w:numId w:val="2"/>
+        </w:numPr>
+      </w:pPr>
+      <w:r>
+        <w:rPr>
+          <w:b/>
+          <w:bCs/>
+        </w:rPr>
+        <w:lastRenderedPageBreak/>
+        <w:t>Class Diagram / Abstraction:</w:t>
+      </w:r>
+      <w:r>
+        <w:t xml:space="preserve"> User, Role, Permission, Resource, </w:t>
+      </w:r>
+      <w:proofErr w:type="spellStart"/>
+      <w:r>
+        <w:t>AccessPolicy</w:t>
+      </w:r>
+      <w:proofErr w:type="spellEnd"/>
+      <w:r>
+        <w:t xml:space="preserve"> Evaluator.</w:t>
+      </w:r>
+    </w:p>
+    <w:p>
+      <w:pPr>
+        <w:numPr>
+          <w:ilvl w:val="1"/>
+          <w:numId w:val="2"/>
+        </w:numPr>
+      </w:pPr>
+      <w:r>
+        <w:rPr>
+          <w:b/>
+          <w:bCs/>
+        </w:rPr>
+        <w:t>Design Patterns:</w:t>
+      </w:r>
+      <w:r>
+        <w:t xml:space="preserve"> </w:t>
+      </w:r>
+      <w:r>
+        <w:rPr>
+          <w:b/>
+          <w:bCs/>
+        </w:rPr>
+        <w:t>Decorator Pattern</w:t>
+      </w:r>
+      <w:r>
+        <w:t xml:space="preserve"> (wrapping permission checks around service calls), </w:t>
+      </w:r>
+      <w:r>
+        <w:rPr>
+          <w:b/>
+          <w:bCs/>
+        </w:rPr>
+        <w:t>Composite Pattern</w:t>
+      </w:r>
+      <w:r>
+        <w:t xml:space="preserve"> (for hierarchical roles/departments).</w:t>
+      </w:r>
+    </w:p>
+    <w:p>
+      <w:pPr>
+        <w:numPr>
+          <w:ilvl w:val="1"/>
+          <w:numId w:val="2"/>
+        </w:numPr>
+      </w:pPr>
+      <w:r>
+        <w:rPr>
+          <w:b/>
+          <w:bCs/>
+        </w:rPr>
+        <w:t>Your Real Example:</w:t>
+      </w:r>
+      <w:r>
+        <w:t xml:space="preserve"> Highlight your </w:t>
+      </w:r>
+      <w:r>
+        <w:rPr>
+          <w:b/>
+          <w:bCs/>
+        </w:rPr>
+        <w:t xml:space="preserve">E-Connect HRMS &amp; Sample </w:t>
+      </w:r>
+      <w:proofErr w:type="spellStart"/>
+      <w:r>
+        <w:rPr>
+          <w:b/>
+          <w:bCs/>
+        </w:rPr>
+        <w:t>Sampark</w:t>
+      </w:r>
+      <w:proofErr w:type="spellEnd"/>
+      <w:r>
+        <w:t xml:space="preserve"> RBAC and user management modules. </w:t>
+      </w:r>
+    </w:p>
+    <w:p>
+      <w:pPr>
+        <w:numPr>
+          <w:ilvl w:val="0"/>
+          <w:numId w:val="2"/>
+        </w:numPr>
+      </w:pPr>
+      <w:r>
+        <w:rPr>
+          <w:b/>
+          <w:bCs/>
+        </w:rPr>
+        <w:t>Design a Notification Gateway Service</w:t>
+      </w:r>
+    </w:p>
+    <w:p>
+      <w:pPr>
+        <w:numPr>
+          <w:ilvl w:val="1"/>
+          <w:numId w:val="2"/>
+        </w:numPr>
+      </w:pPr>
+      <w:r>
+        <w:rPr>
+          <w:b/>
+          <w:bCs/>
+        </w:rPr>
+        <w:t>Class Diagram / Abstraction:</w:t>
+      </w:r>
+      <w:r>
+        <w:t xml:space="preserve"> </w:t>
+      </w:r>
+      <w:proofErr w:type="spellStart"/>
+      <w:r>
+        <w:t>NotificationService</w:t>
+      </w:r>
+      <w:proofErr w:type="spellEnd"/>
+      <w:r>
+        <w:t xml:space="preserve">, </w:t>
+      </w:r>
+      <w:proofErr w:type="spellStart"/>
+      <w:r>
+        <w:t>INotifier</w:t>
+      </w:r>
+      <w:proofErr w:type="spellEnd"/>
+      <w:r>
+        <w:t xml:space="preserve"> (SMS, Email, Push), </w:t>
+      </w:r>
+      <w:proofErr w:type="spellStart"/>
+      <w:r>
+        <w:t>TemplateEngine</w:t>
+      </w:r>
+      <w:proofErr w:type="spellEnd"/>
+      <w:r>
+        <w:t xml:space="preserve">, </w:t>
+      </w:r>
+      <w:proofErr w:type="spellStart"/>
+      <w:r>
+        <w:t>RetryHandler</w:t>
+      </w:r>
+      <w:proofErr w:type="spellEnd"/>
+      <w:r>
+        <w:t>.</w:t>
+      </w:r>
+    </w:p>
+    <w:p>
+      <w:pPr>
+        <w:numPr>
+          <w:ilvl w:val="1"/>
+          <w:numId w:val="2"/>
+        </w:numPr>
+      </w:pPr>
+      <w:r>
+        <w:rPr>
+          <w:b/>
+          <w:bCs/>
+        </w:rPr>
+        <w:t>Design Patterns:</w:t>
+      </w:r>
+      <w:r>
+        <w:t xml:space="preserve"> </w:t>
+      </w:r>
+      <w:r>
+        <w:rPr>
+          <w:b/>
+          <w:bCs/>
+        </w:rPr>
+        <w:t>Adapter Pattern</w:t>
+      </w:r>
+      <w:r>
+        <w:t xml:space="preserve"> (integrating third-party SMS/Email APIs like Twilio/SendGrid), </w:t>
+      </w:r>
+      <w:r>
+        <w:rPr>
+          <w:b/>
+          <w:bCs/>
+        </w:rPr>
+        <w:t>Chain of Responsibility</w:t>
+      </w:r>
+      <w:r>
+        <w:t xml:space="preserve"> (filtering notification channels based on user preferences).</w:t>
+      </w:r>
+    </w:p>
+    <w:p>
+      <w:pPr>
+        <w:numPr>
+          <w:ilvl w:val="0"/>
+          <w:numId w:val="2"/>
+        </w:numPr>
+      </w:pPr>
+      <w:r>
+        <w:rPr>
+          <w:b/>
+          <w:bCs/>
+        </w:rPr>
+        <w:t>Design a Rate-Limiter Middleware Component</w:t>
+      </w:r>
+    </w:p>
+    <w:p>
+      <w:r>
+        <w:rPr>
+          <w:b/>
+          <w:bCs/>
+        </w:rPr>
+        <w:t>Design Patterns:</w:t>
+      </w:r>
+      <w:r>
+        <w:t xml:space="preserve"> </w:t>
+      </w:r>
+      <w:r>
+        <w:rPr>
+          <w:b/>
+          <w:bCs/>
+        </w:rPr>
+        <w:t>Singleton</w:t>
+      </w:r>
+      <w:r>
+        <w:t xml:space="preserve"> for local token bucket state, </w:t>
+      </w:r>
+      <w:r>
+        <w:rPr>
+          <w:b/>
+          <w:bCs/>
+        </w:rPr>
+        <w:t>Middleware / Interceptor</w:t>
+      </w:r>
+      <w:r>
+        <w:t xml:space="preserve"> pattern for handling HTTP request intercepting in .NET / Web APIs.</w:t>
+      </w:r>
+    </w:p>
+    <w:p>
+      <w:r>
+        <w:t>Payment gateway design with the multiple providers and multiple methods</w:t>
+      </w:r>
+    </w:p>
+    <w:p/>
+    <w:p/>
+    <w:p>
+      <w:r>
+        <w:t>Third round:</w:t>
+      </w:r>
+    </w:p>
+    <w:p>
+      <w:r>
+        <w:t xml:space="preserve">.Net core concept and design pattern on the specific scenarios </w:t>
+      </w:r>
+    </w:p>
+    <w:p>
+      <w:r>
+        <w:t>Question from the front-end side</w:t>
+      </w:r>
+    </w:p>
+    <w:p/>
+    <w:p>
+      <w:r>
+        <w:t>Fourth round:</w:t>
+      </w:r>
+    </w:p>
+    <w:p>
+      <w:r>
+        <w:t xml:space="preserve">Hiring manager round </w:t>
+      </w:r>
+    </w:p>
+    <w:p>
+      <w:r>
+        <w:t>-- intro -self and prepare for staff engineer interview that will be presented to director of engineering?</w:t>
+      </w:r>
+    </w:p>
+    <w:p>
+      <w:r>
+        <w:t>-- most challenging project which can be presented to director and high business impact</w:t>
+      </w:r>
+    </w:p>
+    <w:p>
+      <w:r>
+        <w:t>-- azure is not there how do you handle infra and equivalent provider</w:t>
+      </w:r>
+    </w:p>
+    <w:p>
+      <w:r>
+        <w:lastRenderedPageBreak/>
+        <w:t>-- why you are leave Microsoft - hybrid culture,  and mentioned pay scale, product mindset, lead/staff/principal roles</w:t>
+      </w:r>
+    </w:p>
+    <w:p>
+      <w:r>
+        <w:t xml:space="preserve">-- explain </w:t>
+      </w:r>
+      <w:proofErr w:type="spellStart"/>
+      <w:r>
+        <w:t>microsoft</w:t>
+      </w:r>
+      <w:proofErr w:type="spellEnd"/>
+      <w:r>
+        <w:t xml:space="preserve"> journey --&gt;  grown from </w:t>
+      </w:r>
+      <w:proofErr w:type="spellStart"/>
+      <w:r>
+        <w:t>ic</w:t>
+      </w:r>
+      <w:proofErr w:type="spellEnd"/>
+      <w:r>
+        <w:t xml:space="preserve"> to lead to staff level? - pay is also consideration</w:t>
+      </w:r>
+    </w:p>
+    <w:p>
+      <w:r>
+        <w:t xml:space="preserve">-- 3 things about you if anyone asked about you based on my work?  -- </w:t>
+      </w:r>
+    </w:p>
+    <w:p>
+      <w:r>
+        <w:t>-- feedback how to provide team feedback direct/indirect as staff engineer --</w:t>
+      </w:r>
+    </w:p>
+    <w:p>
+      <w:r>
+        <w:t xml:space="preserve">-- day to routine interaction with the stakeholder or how do </w:t>
+      </w:r>
+      <w:proofErr w:type="spellStart"/>
+      <w:r>
+        <w:t>i</w:t>
+      </w:r>
+      <w:proofErr w:type="spellEnd"/>
+      <w:r>
+        <w:t xml:space="preserve"> present my daily routines? -- </w:t>
+      </w:r>
+    </w:p>
+    <w:p>
+      <w:r>
+        <w:t xml:space="preserve">-- architect suggestions against you made against in NHS or NBA example </w:t>
+      </w:r>
+    </w:p>
+    <w:p>
+      <w:r>
+        <w:t>-- diff between lead/</w:t>
+      </w:r>
+      <w:proofErr w:type="spellStart"/>
+      <w:r>
+        <w:t>sr</w:t>
+      </w:r>
+      <w:proofErr w:type="spellEnd"/>
+      <w:r>
+        <w:t xml:space="preserve">  vs staff engineer </w:t>
+      </w:r>
+    </w:p>
+    <w:p>
+      <w:r>
+        <w:t>-- technical debt handling by giving prioritize over the new feature development  -- categorization -- aligns the stakeholder-- follow the methods</w:t>
+      </w:r>
+    </w:p>
+    <w:p>
+      <w:r>
+        <w:t>-- why are you interested in this staff engineer role at UKG based on the current experience</w:t>
+      </w:r>
+    </w:p>
+    <w:p>
+      <w:r>
+        <w:t>-- how do I influence the engineer who don't report to you directly mentioned technical and professional pints from my resume?</w:t>
+      </w:r>
+    </w:p>
+    <w:p>
+      <w:r>
+        <w:t>-- Tell me about the most complex technical initiative you owned end-to-end. How did you slice it into deliverable milestones?</w:t>
+      </w:r>
+    </w:p>
+    <w:p>
+      <w:r>
+        <w:t>-- Tell me about a time you mentored a Senior or Mid-level engineer to help them level up or navigate a complex project.</w:t>
+      </w:r>
+    </w:p>
+    <w:p>
+      <w:r>
+        <w:t>"What are the biggest technical and scaling challenges your engineering group is tackling over the next 12–18 months?"</w:t>
+      </w:r>
+    </w:p>
+    <w:p/>
+    <w:p>
+      <w:r>
+        <w:t>"How does the engineering leadership team balance technical debt resolution with new product features at UKG?"</w:t>
+      </w:r>
+    </w:p>
+    <w:p/>
+    <w:p>
+      <w:r>
+        <w:t>"How would you describe the delivery culture on this team—what distinguishes a good engineer from a great one here?"</w:t>
+      </w:r>
+    </w:p>
+    <w:p/>
+    <w:p>
+      <w:r>
+        <w:t>"Walk me through the most complex feature you built from scratch. What were the bottleneck points?"</w:t>
+      </w:r>
+    </w:p>
+    <w:p/>
+    <w:p>
+      <w:r>
+        <w:lastRenderedPageBreak/>
+        <w:t>"How do you balance short-term feature delivery against long-term technical health and tech debt?"</w:t>
+      </w:r>
+    </w:p>
+    <w:p/>
+    <w:p>
+      <w:r>
+        <w:t>"Tell me about a production outage or critical failure you owned. How did you resolve and prevent it?"</w:t>
+      </w:r>
+    </w:p>
+    <w:p/>
+    <w:p>
+      <w:r>
+        <w:t>"How do you receive critical feedback, and how do you ensure team alignment during shifting priorities?"</w:t>
+      </w:r>
+    </w:p>
+    <w:p/>
+    <w:p/>
+    <w:p>
+      <w:r>
+        <w:t>question to asked-</w:t>
+      </w:r>
+    </w:p>
+    <w:p>
+      <w:r>
+        <w:t>1. Engineering Strategy &amp; Business Alignment</w:t>
+      </w:r>
+    </w:p>
+    <w:p>
+      <w:r>
+        <w:t>A Staff Engineer must bridge business objectives with technical execution.</w:t>
+      </w:r>
+    </w:p>
+    <w:p/>
+    <w:p>
+      <w:r>
+        <w:t>"What are the highest-leverage engineering investments or architectural transformations planned for your org over the next 12 to 18 months?"</w:t>
+      </w:r>
+    </w:p>
+    <w:p/>
+    <w:p>
+      <w:r>
+        <w:t>"How does your leadership team measure the balance between product feature velocity and platform health/technical debt repayment?"</w:t>
+      </w:r>
+    </w:p>
+    <w:p/>
+    <w:p>
+      <w:r>
+        <w:t>"As UKG continues to scale its cloud platforms and multi-tenant systems, what is the single biggest technical risk keeping you up at night?"</w:t>
+      </w:r>
+    </w:p>
+    <w:p/>
+    <w:p>
+      <w:r>
+        <w:t>2. Staff Role Expectations &amp; Impact</w:t>
+      </w:r>
+    </w:p>
+    <w:p>
+      <w:r>
+        <w:t>Clarifies where you will be expected to step in and drive value immediately.</w:t>
+      </w:r>
+    </w:p>
+    <w:p/>
+    <w:p>
+      <w:r>
+        <w:t>"What would successful leadership look like from me in the first 90 days? Is there an urgent cross-team alignment challenge or technical bottleneck waiting for this role?"</w:t>
+      </w:r>
+    </w:p>
+    <w:p/>
+    <w:p>
+      <w:r>
+        <w:lastRenderedPageBreak/>
+        <w:t>"How do Staff Engineers in your group split their time between high-level architectural governance, hands-on prototype/core coding, and organizational leadership?"</w:t>
+      </w:r>
+    </w:p>
+    <w:p/>
+    <w:p>
+      <w:r>
+        <w:t>"What is the current relationship between Staff Engineers, Product Management, and Engineering Managers when resolving trade-offs between scope, timeline, and quality?"</w:t>
+      </w:r>
+    </w:p>
+    <w:p/>
+    <w:p>
+      <w:r>
+        <w:t>3. Organizational Health &amp; Scale</w:t>
+      </w:r>
+    </w:p>
+    <w:p>
+      <w:r>
+        <w:t>Shows interest in system efficiency, team culture, and operational rigor.</w:t>
+      </w:r>
+    </w:p>
+    <w:p/>
+    <w:p>
+      <w:r>
+        <w:t>"How are engineering standards and architectural patterns communicated and adopted across distinct squads or acquired product lines at UKG?"</w:t>
+      </w:r>
+    </w:p>
+    <w:p/>
+    <w:p>
+      <w:r>
+        <w:t>"What is the biggest operational friction point holding engineering squads back from shipping faster or more reliably right now?"</w:t>
+      </w:r>
+    </w:p>
+    <w:p/>
+    <w:p>
+      <w:r>
+        <w:t>"How do you evaluate and foster psychological safety, technical mentorship, and career growth across the senior engineering talent in your org?"</w:t>
+      </w:r>
+    </w:p>
+    <w:p/>
+    <w:p>
+      <w:r>
+        <w:t>On Expectations: "In the first six months, what would success look like for a Staff Engineer joining this group? What core platform or architectural milestones are most critical for the team right now?"</w:t>
+      </w:r>
+    </w:p>
+    <w:p/>
+    <w:p>
+      <w:r>
+        <w:t>On Engineering Culture: "How does UKG strike the balance between driving new feature delivery velocity and addressing core technical debt/platform refactoring across squads?"</w:t>
+      </w:r>
+    </w:p>
+    <w:p/>
+    <w:p>
+      <w:r>
+        <w:t>On Strategy: "What are the biggest technical or scale bottlenecks the platform is facing as UKG expands its multi-tenant SaaS footprint over the next 1–2 years?"</w:t>
       </w:r>
     </w:p>
     <w:sectPr>
@@ -68,6 +1168,251 @@
     </w:sectPr>
   </w:body>
 </w:document>
+</file>
+
+<file path=word/numbering.xml><?xml version="1.0" encoding="utf-8"?>
+<w:numbering xmlns:wpc="http://schemas.microsoft.com/office/word/2010/wordprocessingCanvas" xmlns:cx="http://schemas.microsoft.com/office/drawing/2014/chartex" xmlns:cx1="http://schemas.microsoft.com/office/drawing/2015/9/8/chartex" xmlns:cx2="http://schemas.microsoft.com/office/drawing/2015/10/21/chartex" xmlns:cx3="http://schemas.microsoft.com/office/drawing/2016/5/9/chartex" xmlns:cx4="http://schemas.microsoft.com/office/drawing/2016/5/10/chartex" xmlns:cx5="http://schemas.microsoft.com/office/drawing/2016/5/11/chartex" xmlns:cx6="http://schemas.microsoft.com/office/drawing/2016/5/12/chartex" xmlns:cx7="http://schemas.microsoft.com/office/drawing/2016/5/13/chartex" xmlns:cx8="http://schemas.microsoft.com/office/drawing/2016/5/14/chartex" xmlns:mc="http://schemas.openxmlformats.org/markup-compatibility/2006" xmlns:aink="http://schemas.microsoft.com/office/drawing/2016/ink" xmlns:am3d="http://schemas.microsoft.com/office/drawing/2017/model3d" xmlns:o="urn:schemas-microsoft-com:office:office" xmlns:oel="http://schemas.microsoft.com/office/2019/extlst" xmlns:r="http://schemas.openxmlformats.org/officeDocument/2006/relationships" xmlns:m="http://schemas.openxmlformats.org/officeDocument/2006/math" xmlns:v="urn:schemas-microsoft-com:vml" xmlns:wp14="http://schemas.microsoft.com/office/word/2010/wordprocessingDrawing" xmlns:wp="http://schemas.openxmlformats.org/drawingml/2006/wordprocessingDrawing" xmlns:w10="urn:schemas-microsoft-com:office:word" xmlns:w="http://schemas.openxmlformats.org/wordprocessingml/2006/main" xmlns:w14="http://schemas.microsoft.com/office/word/2010/wordml" xmlns:w15="http://schemas.microsoft.com/office/word/2012/wordml" xmlns:w16cex="http://schemas.microsoft.com/office/word/2018/wordml/cex" xmlns:w16cid="http://schemas.microsoft.com/office/word/2016/wordml/cid" xmlns:w16="http://schemas.microsoft.com/office/word/2018/wordml" xmlns:w16du="http://schemas.microsoft.com/office/word/2023/wordml/word16du" xmlns:w16sdtdh="http://schemas.microsoft.com/office/word/2020/wordml/sdtdatahash" xmlns:w16sdtfl="http://schemas.microsoft.com/office/word/2024/wordml/sdtformatlock" xmlns:w16se="http://schemas.microsoft.com/office/word/2015/wordml/symex" xmlns:wpg="http://schemas.microsoft.com/office/word/2010/wordprocessingGroup" xmlns:wpi="http://schemas.microsoft.com/office/word/2010/wordprocessingInk" xmlns:wne="http://schemas.microsoft.com/office/word/2006/wordml" xmlns:wps="http://schemas.microsoft.com/office/word/2010/wordprocessingShape" mc:Ignorable="w14 w15 w16se w16cid w16 w16cex w16sdtdh w16sdtfl w16du wp14">
+  <w:abstractNum w:abstractNumId="0" w15:restartNumberingAfterBreak="0">
+    <w:nsid w:val="4ADE5D59"/>
+    <w:multiLevelType w:val="multilevel"/>
+    <w:tmpl w:val="E9F27F70"/>
+    <w:lvl w:ilvl="0">
+      <w:start w:val="1"/>
+      <w:numFmt w:val="decimal"/>
+      <w:lvlText w:val="%1."/>
+      <w:lvlJc w:val="left"/>
+      <w:pPr>
+        <w:tabs>
+          <w:tab w:val="num" w:pos="720"/>
+        </w:tabs>
+        <w:ind w:left="720" w:hanging="360"/>
+      </w:pPr>
+    </w:lvl>
+    <w:lvl w:ilvl="1">
+      <w:start w:val="1"/>
+      <w:numFmt w:val="bullet"/>
+      <w:lvlText w:val="o"/>
+      <w:lvlJc w:val="left"/>
+      <w:pPr>
+        <w:tabs>
+          <w:tab w:val="num" w:pos="1440"/>
+        </w:tabs>
+        <w:ind w:left="1440" w:hanging="360"/>
+      </w:pPr>
+      <w:rPr>
+        <w:rFonts w:ascii="Courier New" w:hAnsi="Courier New" w:hint="default"/>
+        <w:sz w:val="20"/>
+      </w:rPr>
+    </w:lvl>
+    <w:lvl w:ilvl="2" w:tentative="1">
+      <w:start w:val="1"/>
+      <w:numFmt w:val="decimal"/>
+      <w:lvlText w:val="%3."/>
+      <w:lvlJc w:val="left"/>
+      <w:pPr>
+        <w:tabs>
+          <w:tab w:val="num" w:pos="2160"/>
+        </w:tabs>
+        <w:ind w:left="2160" w:hanging="360"/>
+      </w:pPr>
+    </w:lvl>
+    <w:lvl w:ilvl="3" w:tentative="1">
+      <w:start w:val="1"/>
+      <w:numFmt w:val="decimal"/>
+      <w:lvlText w:val="%4."/>
+      <w:lvlJc w:val="left"/>
+      <w:pPr>
+        <w:tabs>
+          <w:tab w:val="num" w:pos="2880"/>
+        </w:tabs>
+        <w:ind w:left="2880" w:hanging="360"/>
+      </w:pPr>
+    </w:lvl>
+    <w:lvl w:ilvl="4" w:tentative="1">
+      <w:start w:val="1"/>
+      <w:numFmt w:val="decimal"/>
+      <w:lvlText w:val="%5."/>
+      <w:lvlJc w:val="left"/>
+      <w:pPr>
+        <w:tabs>
+          <w:tab w:val="num" w:pos="3600"/>
+        </w:tabs>
+        <w:ind w:left="3600" w:hanging="360"/>
+      </w:pPr>
+    </w:lvl>
+    <w:lvl w:ilvl="5" w:tentative="1">
+      <w:start w:val="1"/>
+      <w:numFmt w:val="decimal"/>
+      <w:lvlText w:val="%6."/>
+      <w:lvlJc w:val="left"/>
+      <w:pPr>
+        <w:tabs>
+          <w:tab w:val="num" w:pos="4320"/>
+        </w:tabs>
+        <w:ind w:left="4320" w:hanging="360"/>
+      </w:pPr>
+    </w:lvl>
+    <w:lvl w:ilvl="6" w:tentative="1">
+      <w:start w:val="1"/>
+      <w:numFmt w:val="decimal"/>
+      <w:lvlText w:val="%7."/>
+      <w:lvlJc w:val="left"/>
+      <w:pPr>
+        <w:tabs>
+          <w:tab w:val="num" w:pos="5040"/>
+        </w:tabs>
+        <w:ind w:left="5040" w:hanging="360"/>
+      </w:pPr>
+    </w:lvl>
+    <w:lvl w:ilvl="7" w:tentative="1">
+      <w:start w:val="1"/>
+      <w:numFmt w:val="decimal"/>
+      <w:lvlText w:val="%8."/>
+      <w:lvlJc w:val="left"/>
+      <w:pPr>
+        <w:tabs>
+          <w:tab w:val="num" w:pos="5760"/>
+        </w:tabs>
+        <w:ind w:left="5760" w:hanging="360"/>
+      </w:pPr>
+    </w:lvl>
+    <w:lvl w:ilvl="8" w:tentative="1">
+      <w:start w:val="1"/>
+      <w:numFmt w:val="decimal"/>
+      <w:lvlText w:val="%9."/>
+      <w:lvlJc w:val="left"/>
+      <w:pPr>
+        <w:tabs>
+          <w:tab w:val="num" w:pos="6480"/>
+        </w:tabs>
+        <w:ind w:left="6480" w:hanging="360"/>
+      </w:pPr>
+    </w:lvl>
+  </w:abstractNum>
+  <w:abstractNum w:abstractNumId="1" w15:restartNumberingAfterBreak="0">
+    <w:nsid w:val="516A03D1"/>
+    <w:multiLevelType w:val="multilevel"/>
+    <w:tmpl w:val="27401E90"/>
+    <w:lvl w:ilvl="0">
+      <w:start w:val="1"/>
+      <w:numFmt w:val="decimal"/>
+      <w:lvlText w:val="%1."/>
+      <w:lvlJc w:val="left"/>
+      <w:pPr>
+        <w:tabs>
+          <w:tab w:val="num" w:pos="720"/>
+        </w:tabs>
+        <w:ind w:left="720" w:hanging="360"/>
+      </w:pPr>
+    </w:lvl>
+    <w:lvl w:ilvl="1">
+      <w:start w:val="1"/>
+      <w:numFmt w:val="bullet"/>
+      <w:lvlText w:val="o"/>
+      <w:lvlJc w:val="left"/>
+      <w:pPr>
+        <w:tabs>
+          <w:tab w:val="num" w:pos="1440"/>
+        </w:tabs>
+        <w:ind w:left="1440" w:hanging="360"/>
+      </w:pPr>
+      <w:rPr>
+        <w:rFonts w:ascii="Courier New" w:hAnsi="Courier New" w:hint="default"/>
+        <w:sz w:val="20"/>
+      </w:rPr>
+    </w:lvl>
+    <w:lvl w:ilvl="2" w:tentative="1">
+      <w:start w:val="1"/>
+      <w:numFmt w:val="decimal"/>
+      <w:lvlText w:val="%3."/>
+      <w:lvlJc w:val="left"/>
+      <w:pPr>
+        <w:tabs>
+          <w:tab w:val="num" w:pos="2160"/>
+        </w:tabs>
+        <w:ind w:left="2160" w:hanging="360"/>
+      </w:pPr>
+    </w:lvl>
+    <w:lvl w:ilvl="3" w:tentative="1">
+      <w:start w:val="1"/>
+      <w:numFmt w:val="decimal"/>
+      <w:lvlText w:val="%4."/>
+      <w:lvlJc w:val="left"/>
+      <w:pPr>
+        <w:tabs>
+          <w:tab w:val="num" w:pos="2880"/>
+        </w:tabs>
+        <w:ind w:left="2880" w:hanging="360"/>
+      </w:pPr>
+    </w:lvl>
+    <w:lvl w:ilvl="4" w:tentative="1">
+      <w:start w:val="1"/>
+      <w:numFmt w:val="decimal"/>
+      <w:lvlText w:val="%5."/>
+      <w:lvlJc w:val="left"/>
+      <w:pPr>
+        <w:tabs>
+          <w:tab w:val="num" w:pos="3600"/>
+        </w:tabs>
+        <w:ind w:left="3600" w:hanging="360"/>
+      </w:pPr>
+    </w:lvl>
+    <w:lvl w:ilvl="5" w:tentative="1">
+      <w:start w:val="1"/>
+      <w:numFmt w:val="decimal"/>
+      <w:lvlText w:val="%6."/>
+      <w:lvlJc w:val="left"/>
+      <w:pPr>
+        <w:tabs>
+          <w:tab w:val="num" w:pos="4320"/>
+        </w:tabs>
+        <w:ind w:left="4320" w:hanging="360"/>
+      </w:pPr>
+    </w:lvl>
+    <w:lvl w:ilvl="6" w:tentative="1">
+      <w:start w:val="1"/>
+      <w:numFmt w:val="decimal"/>
+      <w:lvlText w:val="%7."/>
+      <w:lvlJc w:val="left"/>
+      <w:pPr>
+        <w:tabs>
+          <w:tab w:val="num" w:pos="5040"/>
+        </w:tabs>
+        <w:ind w:left="5040" w:hanging="360"/>
+      </w:pPr>
+    </w:lvl>
+    <w:lvl w:ilvl="7" w:tentative="1">
+      <w:start w:val="1"/>
+      <w:numFmt w:val="decimal"/>
+      <w:lvlText w:val="%8."/>
+      <w:lvlJc w:val="left"/>
+      <w:pPr>
+        <w:tabs>
+          <w:tab w:val="num" w:pos="5760"/>
+        </w:tabs>
+        <w:ind w:left="5760" w:hanging="360"/>
+      </w:pPr>
+    </w:lvl>
+    <w:lvl w:ilvl="8" w:tentative="1">
+      <w:start w:val="1"/>
+      <w:numFmt w:val="decimal"/>
+      <w:lvlText w:val="%9."/>
+      <w:lvlJc w:val="left"/>
+      <w:pPr>
+        <w:tabs>
+          <w:tab w:val="num" w:pos="6480"/>
+        </w:tabs>
+        <w:ind w:left="6480" w:hanging="360"/>
+      </w:pPr>
+    </w:lvl>
+  </w:abstractNum>
+  <w:num w:numId="1" w16cid:durableId="1081410741">
+    <w:abstractNumId w:val="0"/>
+  </w:num>
+  <w:num w:numId="2" w16cid:durableId="1747535940">
+    <w:abstractNumId w:val="1"/>
+  </w:num>
+</w:numbering>
 </file>
 
 <file path=word/styles.xml><?xml version="1.0" encoding="utf-8"?>

</xml_diff>